<commit_message>
updated level 1, and kinda but not really level 3
title
</commit_message>
<xml_diff>
--- a/Planning And Documentation/The Child and the Snake.docx
+++ b/Planning And Documentation/The Child and the Snake.docx
@@ -80,6 +80,9 @@
       <w:r>
         <w:t>Tutorial</w:t>
       </w:r>
+      <w:r>
+        <w:t>/level 1</w:t>
+      </w:r>
     </w:p>
     <w:p>
       <w:r>
@@ -130,9 +133,86 @@
         <w:t>Were the withered stalks of all the plants.</w:t>
       </w:r>
     </w:p>
+    <w:p>
+      <w:r>
+        <w:t>Left to die and rot in the dark,</w:t>
+      </w:r>
+    </w:p>
+    <w:p>
+      <w:r>
+        <w:t xml:space="preserve">Like the end of life’s crude remark. </w:t>
+      </w:r>
+    </w:p>
     <w:p/>
+    <w:p>
+      <w:r>
+        <w:t>The dirt and worms had all but left,</w:t>
+      </w:r>
+    </w:p>
+    <w:p>
+      <w:r>
+        <w:t xml:space="preserve">Wondering </w:t>
+      </w:r>
+      <w:r>
+        <w:t>why the garden was of life bereft.</w:t>
+      </w:r>
+    </w:p>
+    <w:p>
+      <w:r>
+        <w:t xml:space="preserve">And in the empty, cold, </w:t>
+      </w:r>
+      <w:r>
+        <w:t xml:space="preserve">and </w:t>
+      </w:r>
+      <w:r>
+        <w:t>lifeless garden,</w:t>
+      </w:r>
+    </w:p>
+    <w:p>
+      <w:r>
+        <w:t xml:space="preserve">A voice whispered from </w:t>
+      </w:r>
+      <w:r>
+        <w:t>the verdant turned spartan.</w:t>
+      </w:r>
+    </w:p>
     <w:p/>
+    <w:p>
+      <w:r>
+        <w:t>“It is time to leave,” the voice did say,</w:t>
+      </w:r>
+    </w:p>
+    <w:p>
+      <w:r>
+        <w:t>“Leave this garden, and get away.</w:t>
+      </w:r>
+    </w:p>
+    <w:p>
+      <w:r>
+        <w:t>“The shadows will find you, hunt and devour,</w:t>
+      </w:r>
+    </w:p>
+    <w:p>
+      <w:r>
+        <w:t>“If you do not flee this hour.”</w:t>
+      </w:r>
+    </w:p>
     <w:p/>
+    <w:p>
+      <w:r>
+        <w:t>Level 2</w:t>
+      </w:r>
+    </w:p>
+    <w:p>
+      <w:r>
+        <w:t>“They came from nowhere,” the voice said again,</w:t>
+      </w:r>
+    </w:p>
+    <w:p>
+      <w:r>
+        <w:t xml:space="preserve">“Devouring all that lived and breathed </w:t>
+      </w:r>
+    </w:p>
     <w:sectPr>
       <w:pgSz w:w="12240" w:h="15840"/>
       <w:pgMar w:top="1440" w:right="1440" w:bottom="1440" w:left="1440" w:header="708" w:footer="708" w:gutter="0"/>

</xml_diff>